<commit_message>
Update Mekhos quotation: company name and repo-based 44-week timeline
Vendor renamed to Next Generation Software Solutions Pvt. Ltd. per owner
selection. Delivery timeline restated from the migration plan's own
milestone estimates (KB-080 s6: M2 6-8 wks, M3 12-16, M4 16-22, M5
overlapped, M6 4-6) as five phases totalling 44 weeks (~10 months),
replacing the earlier 28-week estimate. Total value unchanged at
INR 8,00,000.

Co-Authored-By: Claude Fable 5 <noreply@anthropic.com>
Claude-Session: https://claude.ai/code/session_016LDwyKHwEXpyzWLxNqeWs6
</commit_message>
<xml_diff>
--- a/docs/quotation/Mekhos-ERP-Quotation.docx
+++ b/docs/quotation/Mekhos-ERP-Quotation.docx
@@ -13,10 +13,10 @@
           <w:b/>
           <w:bCs/>
           <w:color w:val="1F3864"/>
-          <w:sz w:val="40"/>
-          <w:szCs w:val="40"/>
-        </w:rPr>
-        <w:t xml:space="preserve">NEXCORE SOFTWARE SOLUTIONS PVT. LTD.</w:t>
+          <w:sz w:val="34"/>
+          <w:szCs w:val="34"/>
+        </w:rPr>
+        <w:t xml:space="preserve">NEXT GENERATION SOFTWARE SOLUTIONS PVT. LTD.</w:t>
       </w:r>
     </w:p>
     <w:p>
@@ -49,7 +49,7 @@
           <w:sz w:val="17"/>
           <w:szCs w:val="17"/>
         </w:rPr>
-        <w:t xml:space="preserve">No. 42, 2nd Floor, Udyog Vihar, Peenya Industrial Area, Bengaluru – 560058  |  info@nexcoresolutions.in  |  +91 98450 00042</w:t>
+        <w:t xml:space="preserve">No. 42, 2nd Floor, Udyog Vihar, Peenya Industrial Area, Bengaluru – 560058  |  info@nextgensoftware.in  |  +91 98450 00042</w:t>
       </w:r>
     </w:p>
     <w:p>
@@ -159,7 +159,7 @@
                 <w:sz w:val="21"/>
                 <w:szCs w:val="21"/>
               </w:rPr>
-              <w:t xml:space="preserve">Quotation No.: NCS/QTN/2026-27/014</w:t>
+              <w:t xml:space="preserve">Quotation No.: NGS/QTN/2026-27/014</w:t>
             </w:r>
           </w:p>
           <w:p>
@@ -3100,7 +3100,7 @@
                 <w:sz w:val="20"/>
                 <w:szCs w:val="20"/>
               </w:rPr>
-              <w:t xml:space="preserve">On completion of Masters, Purchase &amp; Inventory modules (staging demo)</w:t>
+              <w:t xml:space="preserve">On completion of Foundation and Core modules (staging demo)</w:t>
             </w:r>
           </w:p>
         </w:tc>
@@ -3388,7 +3388,7 @@
           <w:sz w:val="21"/>
           <w:szCs w:val="21"/>
         </w:rPr>
-        <w:t xml:space="preserve">Estimated overall duration: 28 weeks from purchase order and receipt of advance.</w:t>
+        <w:t xml:space="preserve">Estimated overall duration: 44 weeks (approximately 10 months) from purchase order and receipt of advance, phased as below.</w:t>
       </w:r>
     </w:p>
     <w:tbl>
@@ -3574,7 +3574,7 @@
                 <w:sz w:val="20"/>
                 <w:szCs w:val="20"/>
               </w:rPr>
-              <w:t xml:space="preserve">Requirement study, process mapping &amp; system design sign-off</w:t>
+              <w:t xml:space="preserve">Foundation — requirement sign-off, system architecture, security, application shell</w:t>
             </w:r>
           </w:p>
         </w:tc>
@@ -3605,7 +3605,7 @@
                 <w:sz w:val="20"/>
                 <w:szCs w:val="20"/>
               </w:rPr>
-              <w:t xml:space="preserve">Weeks 1 – 4</w:t>
+              <w:t xml:space="preserve">Weeks 1 – 8</w:t>
             </w:r>
           </w:p>
         </w:tc>
@@ -3671,7 +3671,7 @@
                 <w:sz w:val="20"/>
                 <w:szCs w:val="20"/>
               </w:rPr>
-              <w:t xml:space="preserve">Masters, Administration &amp; Design/BOM</w:t>
+              <w:t xml:space="preserve">Core modules — Masters, Design/BOM, Purchase, GRN, SCN, Inventory</w:t>
             </w:r>
           </w:p>
         </w:tc>
@@ -3703,7 +3703,7 @@
                 <w:sz w:val="20"/>
                 <w:szCs w:val="20"/>
               </w:rPr>
-              <w:t xml:space="preserve">Weeks 5 – 9</w:t>
+              <w:t xml:space="preserve">Weeks 9 – 22</w:t>
             </w:r>
           </w:p>
         </w:tc>
@@ -3767,7 +3767,7 @@
                 <w:sz w:val="20"/>
                 <w:szCs w:val="20"/>
               </w:rPr>
-              <w:t xml:space="preserve">Purchase, GRN, SCN &amp; Authorization</w:t>
+              <w:t xml:space="preserve">Advanced modules — Sub-contract, Production &amp; Planning, Dispatch/DC, Dashboard &amp; Reports</w:t>
             </w:r>
           </w:p>
         </w:tc>
@@ -3798,7 +3798,7 @@
                 <w:sz w:val="20"/>
                 <w:szCs w:val="20"/>
               </w:rPr>
-              <w:t xml:space="preserve">Weeks 10 – 15</w:t>
+              <w:t xml:space="preserve">Weeks 23 – 38</w:t>
             </w:r>
           </w:p>
         </w:tc>
@@ -3864,7 +3864,7 @@
                 <w:sz w:val="20"/>
                 <w:szCs w:val="20"/>
               </w:rPr>
-              <w:t xml:space="preserve">Inventory, Sub-contract, Production &amp; Planning</w:t>
+              <w:t xml:space="preserve">Hardening &amp; QA (runs in parallel with Phases 2–3)</w:t>
             </w:r>
           </w:p>
         </w:tc>
@@ -3896,7 +3896,7 @@
                 <w:sz w:val="20"/>
                 <w:szCs w:val="20"/>
               </w:rPr>
-              <w:t xml:space="preserve">Weeks 16 – 21</w:t>
+              <w:t xml:space="preserve">Weeks 33 – 40</w:t>
             </w:r>
           </w:p>
         </w:tc>
@@ -3960,7 +3960,7 @@
                 <w:sz w:val="20"/>
                 <w:szCs w:val="20"/>
               </w:rPr>
-              <w:t xml:space="preserve">Dispatch/DC, Dashboard &amp; Reports</w:t>
+              <w:t xml:space="preserve">Data migration, UAT, training &amp; go-live</w:t>
             </w:r>
           </w:p>
         </w:tc>
@@ -3991,105 +3991,7 @@
                 <w:sz w:val="20"/>
                 <w:szCs w:val="20"/>
               </w:rPr>
-              <w:t xml:space="preserve">Weeks 22 – 24</w:t>
-            </w:r>
-          </w:p>
-        </w:tc>
-      </w:tr>
-      <w:tr>
-        <w:tc>
-          <w:tcPr>
-            <w:tcW w:type="dxa" w:w="1400"/>
-            <w:tcBorders>
-              <w:top w:val="single" w:color="BFBFBF" w:sz="4"/>
-              <w:left w:val="single" w:color="BFBFBF" w:sz="4"/>
-              <w:bottom w:val="single" w:color="BFBFBF" w:sz="4"/>
-              <w:right w:val="single" w:color="BFBFBF" w:sz="4"/>
-            </w:tcBorders>
-            <w:shd w:fill="DEEAF6" w:val="clear"/>
-            <w:tcMar>
-              <w:top w:type="dxa" w:w="80"/>
-              <w:left w:type="dxa" w:w="110"/>
-              <w:bottom w:type="dxa" w:w="80"/>
-              <w:right w:type="dxa" w:w="110"/>
-            </w:tcMar>
-          </w:tcPr>
-          <w:p>
-            <w:pPr>
-              <w:spacing w:after="0"/>
-            </w:pPr>
-            <w:r>
-              <w:rPr>
-                <w:rFonts w:ascii="Calibri" w:cs="Calibri" w:eastAsia="Calibri" w:hAnsi="Calibri"/>
-                <w:b/>
-                <w:bCs/>
-                <w:sz w:val="20"/>
-                <w:szCs w:val="20"/>
-              </w:rPr>
-              <w:t xml:space="preserve">Phase 6</w:t>
-            </w:r>
-          </w:p>
-        </w:tc>
-        <w:tc>
-          <w:tcPr>
-            <w:tcW w:type="dxa" w:w="6140"/>
-            <w:tcBorders>
-              <w:top w:val="single" w:color="BFBFBF" w:sz="4"/>
-              <w:left w:val="single" w:color="BFBFBF" w:sz="4"/>
-              <w:bottom w:val="single" w:color="BFBFBF" w:sz="4"/>
-              <w:right w:val="single" w:color="BFBFBF" w:sz="4"/>
-            </w:tcBorders>
-            <w:shd w:fill="DEEAF6" w:val="clear"/>
-            <w:tcMar>
-              <w:top w:type="dxa" w:w="80"/>
-              <w:left w:type="dxa" w:w="110"/>
-              <w:bottom w:type="dxa" w:w="80"/>
-              <w:right w:type="dxa" w:w="110"/>
-            </w:tcMar>
-          </w:tcPr>
-          <w:p>
-            <w:pPr>
-              <w:spacing w:after="0"/>
-            </w:pPr>
-            <w:r>
-              <w:rPr>
-                <w:rFonts w:ascii="Calibri" w:cs="Calibri" w:eastAsia="Calibri" w:hAnsi="Calibri"/>
-                <w:sz w:val="20"/>
-                <w:szCs w:val="20"/>
-              </w:rPr>
-              <w:t xml:space="preserve">Data migration, UAT, training &amp; go-live</w:t>
-            </w:r>
-          </w:p>
-        </w:tc>
-        <w:tc>
-          <w:tcPr>
-            <w:tcW w:type="dxa" w:w="2100"/>
-            <w:tcBorders>
-              <w:top w:val="single" w:color="BFBFBF" w:sz="4"/>
-              <w:left w:val="single" w:color="BFBFBF" w:sz="4"/>
-              <w:bottom w:val="single" w:color="BFBFBF" w:sz="4"/>
-              <w:right w:val="single" w:color="BFBFBF" w:sz="4"/>
-            </w:tcBorders>
-            <w:shd w:fill="DEEAF6" w:val="clear"/>
-            <w:tcMar>
-              <w:top w:type="dxa" w:w="80"/>
-              <w:left w:type="dxa" w:w="110"/>
-              <w:bottom w:type="dxa" w:w="80"/>
-              <w:right w:type="dxa" w:w="110"/>
-            </w:tcMar>
-          </w:tcPr>
-          <w:p>
-            <w:pPr>
-              <w:spacing w:after="0"/>
-              <w:jc w:val="center"/>
-            </w:pPr>
-            <w:r>
-              <w:rPr>
-                <w:rFonts w:ascii="Calibri" w:cs="Calibri" w:eastAsia="Calibri" w:hAnsi="Calibri"/>
-                <w:sz w:val="20"/>
-                <w:szCs w:val="20"/>
-              </w:rPr>
-              <w:t xml:space="preserve">Weeks 25 – 28</w:t>
+              <w:t xml:space="preserve">Weeks 39 – 44</w:t>
             </w:r>
           </w:p>
         </w:tc>
@@ -4390,7 +4292,7 @@
           <w:sz w:val="21"/>
           <w:szCs w:val="21"/>
         </w:rPr>
-        <w:t xml:space="preserve">We look forward to partnering with Mekhos on this implementation. Kindly issue your purchase order in favour of NexCore Software Solutions Pvt. Ltd. to commence the engagement.</w:t>
+        <w:t xml:space="preserve">We look forward to partnering with Mekhos on this implementation. Kindly issue your purchase order in favour of Next Generation Software Solutions Pvt. Ltd. to commence the engagement.</w:t>
       </w:r>
     </w:p>
     <w:p>
@@ -4418,7 +4320,7 @@
           <w:sz w:val="21"/>
           <w:szCs w:val="21"/>
         </w:rPr>
-        <w:t xml:space="preserve">For NexCore Software Solutions Pvt. Ltd.</w:t>
+        <w:t xml:space="preserve">For Next Generation Software Solutions Pvt. Ltd.</w:t>
       </w:r>
     </w:p>
     <w:p>

</xml_diff>

<commit_message>
Reissue Mekhos quotation as proprietorship under NextGen Software Solutions
Vendor restated as a sole proprietorship: trade name NextGen Software
Solutions, Proprietor Prakash A. Removed the Pvt. Ltd. suffix (no company
is incorporated yet) and replaced the GST-extra clause with a
not-registered-under-GST note. Scope, INR 8,00,000 value and the 44-week
timeline are unchanged.

Co-Authored-By: Claude Fable 5 <noreply@anthropic.com>
Claude-Session: https://claude.ai/code/session_016LDwyKHwEXpyzWLxNqeWs6
</commit_message>
<xml_diff>
--- a/docs/quotation/Mekhos-ERP-Quotation.docx
+++ b/docs/quotation/Mekhos-ERP-Quotation.docx
@@ -13,10 +13,10 @@
           <w:b/>
           <w:bCs/>
           <w:color w:val="1F3864"/>
-          <w:sz w:val="34"/>
-          <w:szCs w:val="34"/>
-        </w:rPr>
-        <w:t xml:space="preserve">NEXT GENERATION SOFTWARE SOLUTIONS PVT. LTD.</w:t>
+          <w:sz w:val="38"/>
+          <w:szCs w:val="38"/>
+        </w:rPr>
+        <w:t xml:space="preserve">NEXTGEN SOFTWARE SOLUTIONS</w:t>
       </w:r>
     </w:p>
     <w:p>
@@ -31,7 +31,7 @@
           <w:sz w:val="19"/>
           <w:szCs w:val="19"/>
         </w:rPr>
-        <w:t xml:space="preserve">Enterprise Software  |  ERP Solutions  |  Digital Manufacturing</w:t>
+        <w:t xml:space="preserve">Proprietor: Prakash A.  |  Enterprise Software  |  ERP Solutions  |  Digital Manufacturing</w:t>
       </w:r>
     </w:p>
     <w:p>
@@ -2834,7 +2834,7 @@
           <w:sz w:val="21"/>
           <w:szCs w:val="21"/>
         </w:rPr>
-        <w:t xml:space="preserve">Prices are exclusive of GST, which will be charged extra at the prevailing rate (currently 18%).</w:t>
+        <w:t xml:space="preserve">GST is not currently applicable, as the supplier is not registered under GST (services turnover below the registration threshold). If GST registration is obtained during the engagement, GST will be charged extra at the prevailing rate on subsequent invoices.</w:t>
       </w:r>
     </w:p>
     <w:p>
@@ -4292,7 +4292,7 @@
           <w:sz w:val="21"/>
           <w:szCs w:val="21"/>
         </w:rPr>
-        <w:t xml:space="preserve">We look forward to partnering with Mekhos on this implementation. Kindly issue your purchase order in favour of Next Generation Software Solutions Pvt. Ltd. to commence the engagement.</w:t>
+        <w:t xml:space="preserve">We look forward to partnering with Mekhos on this implementation. Kindly issue your purchase order in favour of NextGen Software Solutions (Proprietor: Prakash A.) to commence the engagement.</w:t>
       </w:r>
     </w:p>
     <w:p>
@@ -4320,7 +4320,7 @@
           <w:sz w:val="21"/>
           <w:szCs w:val="21"/>
         </w:rPr>
-        <w:t xml:space="preserve">For Next Generation Software Solutions Pvt. Ltd.</w:t>
+        <w:t xml:space="preserve">For NextGen Software Solutions (Proprietor: Prakash A.)</w:t>
       </w:r>
     </w:p>
     <w:p>
@@ -4347,7 +4347,7 @@
           <w:sz w:val="21"/>
           <w:szCs w:val="21"/>
         </w:rPr>
-        <w:t xml:space="preserve">Kumar A. G.  |  Director – Delivery</w:t>
+        <w:t xml:space="preserve">Prakash A.  |  Proprietor</w:t>
       </w:r>
     </w:p>
     <w:sectPr>

</xml_diff>

<commit_message>
Mekhos quotation: rename vendor to NextMind Software Solutions, 10% advance
Trade name changed from NextGen to NextMind Software Solutions (quotation
ref now NMS/QTN/2026-27/014). Advance reduced to INR 80,000 (10%); the
remaining milestones rebalanced to 30/30/30 so the total stays INR 8,00,000.

Co-Authored-By: Claude Fable 5 <noreply@anthropic.com>
Claude-Session: https://claude.ai/code/session_016LDwyKHwEXpyzWLxNqeWs6
</commit_message>
<xml_diff>
--- a/docs/quotation/Mekhos-ERP-Quotation.docx
+++ b/docs/quotation/Mekhos-ERP-Quotation.docx
@@ -16,7 +16,7 @@
           <w:sz w:val="38"/>
           <w:szCs w:val="38"/>
         </w:rPr>
-        <w:t xml:space="preserve">NEXTGEN SOFTWARE SOLUTIONS</w:t>
+        <w:t xml:space="preserve">NEXTMIND SOFTWARE SOLUTIONS</w:t>
       </w:r>
     </w:p>
     <w:p>
@@ -49,7 +49,7 @@
           <w:sz w:val="17"/>
           <w:szCs w:val="17"/>
         </w:rPr>
-        <w:t xml:space="preserve">No. 42, 2nd Floor, Udyog Vihar, Peenya Industrial Area, Bengaluru – 560058  |  info@nextgensoftware.in  |  +91 98450 00042</w:t>
+        <w:t xml:space="preserve">No. 42, 2nd Floor, Udyog Vihar, Peenya Industrial Area, Bengaluru – 560058  |  info@nextmindsoftware.in  |  +91 98450 00042</w:t>
       </w:r>
     </w:p>
     <w:p>
@@ -159,7 +159,7 @@
                 <w:sz w:val="21"/>
                 <w:szCs w:val="21"/>
               </w:rPr>
-              <w:t xml:space="preserve">Quotation No.: NGS/QTN/2026-27/014</w:t>
+              <w:t xml:space="preserve">Quotation No.: NMS/QTN/2026-27/014</w:t>
             </w:r>
           </w:p>
           <w:p>
@@ -3036,7 +3036,7 @@
                 <w:sz w:val="20"/>
                 <w:szCs w:val="20"/>
               </w:rPr>
-              <w:t xml:space="preserve">30%</w:t>
+              <w:t xml:space="preserve">10%</w:t>
             </w:r>
           </w:p>
         </w:tc>
@@ -3067,7 +3067,7 @@
                 <w:sz w:val="20"/>
                 <w:szCs w:val="20"/>
               </w:rPr>
-              <w:t xml:space="preserve">2,40,000</w:t>
+              <w:t xml:space="preserve">80,000</w:t>
             </w:r>
           </w:p>
         </w:tc>
@@ -3323,7 +3323,7 @@
                 <w:sz w:val="20"/>
                 <w:szCs w:val="20"/>
               </w:rPr>
-              <w:t xml:space="preserve">10%</w:t>
+              <w:t xml:space="preserve">30%</w:t>
             </w:r>
           </w:p>
         </w:tc>
@@ -3355,7 +3355,7 @@
                 <w:sz w:val="20"/>
                 <w:szCs w:val="20"/>
               </w:rPr>
-              <w:t xml:space="preserve">80,000</w:t>
+              <w:t xml:space="preserve">2,40,000</w:t>
             </w:r>
           </w:p>
         </w:tc>
@@ -4292,7 +4292,7 @@
           <w:sz w:val="21"/>
           <w:szCs w:val="21"/>
         </w:rPr>
-        <w:t xml:space="preserve">We look forward to partnering with Mekhos on this implementation. Kindly issue your purchase order in favour of NextGen Software Solutions (Proprietor: Prakash A.) to commence the engagement.</w:t>
+        <w:t xml:space="preserve">We look forward to partnering with Mekhos on this implementation. Kindly issue your purchase order in favour of NextMind Software Solutions (Proprietor: Prakash A.) to commence the engagement.</w:t>
       </w:r>
     </w:p>
     <w:p>
@@ -4320,7 +4320,7 @@
           <w:sz w:val="21"/>
           <w:szCs w:val="21"/>
         </w:rPr>
-        <w:t xml:space="preserve">For NextGen Software Solutions (Proprietor: Prakash A.)</w:t>
+        <w:t xml:space="preserve">For NextMind Software Solutions (Proprietor: Prakash A.)</w:t>
       </w:r>
     </w:p>
     <w:p>

</xml_diff>

<commit_message>
Mekhos quotation: address client by full legal name
Addressee and subject line now read Mekhos Technology Services Pvt. Ltd.

Co-Authored-By: Claude Fable 5 <noreply@anthropic.com>
Claude-Session: https://claude.ai/code/session_016LDwyKHwEXpyzWLxNqeWs6
</commit_message>
<xml_diff>
--- a/docs/quotation/Mekhos-ERP-Quotation.docx
+++ b/docs/quotation/Mekhos-ERP-Quotation.docx
@@ -121,7 +121,7 @@
                 <w:sz w:val="21"/>
                 <w:szCs w:val="21"/>
               </w:rPr>
-              <w:t xml:space="preserve">M/s. MEKHOS</w:t>
+              <w:t xml:space="preserve">M/s. Mekhos Technology Services Pvt. Ltd.</w:t>
             </w:r>
           </w:p>
           <w:p>
@@ -205,7 +205,7 @@
           <w:sz w:val="21"/>
           <w:szCs w:val="21"/>
         </w:rPr>
-        <w:t xml:space="preserve">Subject: Quotation for the design, development and implementation of a custom ERP system for Mekhos.</w:t>
+        <w:t xml:space="preserve">Subject: Quotation for the design, development and implementation of a custom ERP system for Mekhos Technology Services Pvt. Ltd.</w:t>
       </w:r>
     </w:p>
     <w:p>

</xml_diff>